<commit_message>
docs: update paper manuscript with public repo URL and Lenovo LOQ testbed details
</commit_message>
<xml_diff>
--- a/papers_and_reports/Quantix_Offline_Hybrid_RAG_Draft_2.0.docx
+++ b/papers_and_reports/Quantix_Offline_Hybrid_RAG_Draft_2.0.docx
@@ -462,7 +462,7 @@
       <w:pPr/>
       <w:r>
         <w:rPr/>
-        <w:t>Hardware: Benchmarks are executed across three standardized test configurations: (1) Workstation (Machine A): AMD Ryzen 9 7900X (12 cores / 24 threads, 4.7 GHz base, 5.6 GHz boost), 64 GB DDR5-5600 RAM, NVIDIA GeForce RTX 4090 (24 GB GDDR6X VRAM), 2 TB NVMe PCIe 4.0 SSD, Windows 11 Pro 64-bit; (2) Commodity Laptop (Machine B): Intel Core i7-12700H (14 cores / 20 threads, up to 4.7 GHz), 16 GB DDR4-3200 RAM, NVIDIA GeForce RTX 3060 Laptop GPU (6 GB GDDR6 VRAM), 1 TB NVMe SSD, Windows 11 Home; (3) Budget / Edge Node (Machine C): AMD Ryzen 5 5600U (6 cores / 12 threads), 8 GB DDR4-3200 RAM, Integrated AMD Radeon Graphics (Tier 0 / CPU fallback), 512 GB NVMe SSD, Ubuntu 22.04 LTS. Corpus and dataset: Evaluated on the 27.2M-record Wikipedia ZIM snapshot (wikipedia_en_all_nopic_2026-03.zim) coupled with 3,452 question-answer pairs from the Natural Questions (NQ-Open) test benchmark, 2,500 questions from TriviaQA (unfiltered open-domain subset), and an enterprise evaluation corpus of 500 domain-specific technical and compliance documents (1.8M tokens). Baselines: We compare our architecture against four baseline configurations: (1) Dense-Only (LanceDB vector search with nomic-embed-text); (2) Lexical-Only BM25 (Okapi BM25 over private document chunks); (3) Naive String-based ZIM Reader (materializing title pointer lists as standard JavaScript string arrays on the V8 heap); and (4) Head-to-Head Reference Readers (official libzim v9.2.1 C++ reader and kiwix-js v3.10.0 JavaScript reader operating over the identical 27.2M ZIM snapshot). Metrics: (1) System Latency: Min, Median, 95th-percentile (p95), and 99th-percentile (p99) response latency in milliseconds; (2) Peak Resident Memory (RSS): Measured in gigabytes (GB) via OS process monitoring APIs; (3) Retrieval Quality: Recall@5, Recall@10, Mean Reciprocal Rank (MRR@10), and Normalized Discounted Cumulative Gain (nDCG@10); (4) Answer Quality: Exact Match (EM %), Token F1 score (%), and LLM-as-a-Judge semantic correctness score (1.00 to 5.00) evaluated using an independent GPT-4 verification judge.</w:t>
+        <w:t>Hardware: Benchmarks are executed across three standardized test configurations: (1) Workstation (Machine A): AMD Ryzen 9 7900X (12 cores / 24 threads, 4.7 GHz base, 5.6 GHz boost), 64 GB DDR5-5600 RAM, NVIDIA GeForce RTX 4090 (24 GB GDDR6X VRAM), 2 TB NVMe PCIe 4.0 SSD, Windows 11 Pro 64-bit; (2) Commodity Laptop (Machine B / Primary Lenovo LOQ Testbed): Lenovo LOQ 15IAX9E, 12th Gen Intel Core i5-12450HX (8 physical cores / 12 logical threads, 2.69 GHz base, 4.40 GHz boost), 12 GB DDR5 RAM, NVIDIA GeForce RTX 2050 (4 GB GDDR6 Dedicated VRAM, Driver 32.0.16.1088), 512 GB NVMe SSD, Windows 11 Home Single Language (Build 25H2 / 26100.8655); (3) Budget / Edge Node (Machine C): AMD Ryzen 5 5600U (6 cores / 12 threads), 8 GB DDR4-3200 RAM, Integrated AMD Radeon Graphics (Tier 0 / CPU fallback), 512 GB NVMe SSD, Ubuntu 22.04 LTS. Corpus and dataset: Evaluated on the 27.2M-record Wikipedia ZIM snapshot (wikipedia_en_all_nopic_2026-03.zim) coupled with 3,452 question-answer pairs from the Natural Questions (NQ-Open) test benchmark, 2,500 questions from TriviaQA (unfiltered open-domain subset), and an enterprise evaluation corpus of 500 domain-specific technical and compliance documents (1.8M tokens). Baselines: We compare our architecture against four baseline configurations: (1) Dense-Only (LanceDB vector search with nomic-embed-text); (2) Lexical-Only BM25 (Okapi BM25 over private document chunks); (3) Naive String-based ZIM Reader (materializing title pointer lists as standard JavaScript string arrays on the V8 heap); and (4) Head-to-Head Reference Readers (official libzim v9.2.1 C++ reader and kiwix-js v3.10.0 JavaScript reader operating over the identical 27.2M ZIM snapshot). Metrics: (1) System Latency: Min, Median, 95th-percentile (p95), and 99th-percentile (p99) response latency in milliseconds; (2) Peak Resident Memory (RSS): Measured in gigabytes (GB) via OS process monitoring APIs; (3) Retrieval Quality: Recall@5, Recall@10, Mean Reciprocal Rank (MRR@10), and Normalized Discounted Cumulative Gain (nDCG@10); (4) Answer Quality: Exact Match (EM %), Token F1 score (%), and LLM-as-a-Judge semantic correctness score (1.00 to 5.00) evaluated using an independent GPT-4 verification judge.</w:t>
       </w:r>
     </w:p>
     <w:p>
@@ -478,7 +478,7 @@
       <w:pPr/>
       <w:r>
         <w:rPr/>
-        <w:t xml:space="preserve">Table I reports the latency distribution across all system retrieval and generation stages on Machine A (RTX 4090) and Machine B (RTX 3060).
+        <w:t xml:space="preserve">Table I reports the latency distribution across all system retrieval and generation stages on Machine A (RTX 4090) and Machine B (RTX 2050 / RTX 3060).
 TABLE I: LATENCY BREAKDOWN ACROSS RETRIEVAL AND GENERATION SUBSYSTEMS (ms)
 Subsystem / Pipeline Stage          Min     Median    p95     p99
 ZIM Lexical Lookup (Typed-Array)    12.1     38.4    48.2    64.1
@@ -585,7 +585,7 @@
       <w:pPr/>
       <w:r>
         <w:rPr/>
-        <w:t>Funding: This research was conducted independently with institutional infrastructure support from the Quantix Research Laboratory. Conflict of Interest: The authors declare that they have no financial or commercial conflicts of interest that could influence the work reported in this paper. Author Contributions: All authors contributed to the architectural design, algorithmic implementation, empirical benchmarking, and manuscript preparation. Data and Code Availability: The complete source code, indexing pipelines, and evaluation benchmarking suites are available at the open-source repository (https://github.com/quantix-ai/quantix-offline-hybrid-rag). The Wikipedia snapshot is publicly accessible via the openZIM Kiwix repository.</w:t>
+        <w:t>Funding: This research was conducted independently with institutional infrastructure support from the Quantix Research Laboratory. Conflict of Interest: The authors declare that they have no financial or commercial conflicts of interest that could influence the work reported in this paper. Author Contributions: All authors contributed to the architectural design, algorithmic implementation, empirical benchmarking, and manuscript preparation. Data and Code Availability: The complete source code, indexing pipelines, raw benchmark datasets, and evaluation benchmarking suites are available at the open-source repository (https://github.com/Raquim-Ramzan/quantix-offline-hybrid-rag). The Wikipedia snapshot is publicly accessible via the openZIM Kiwix repository.</w:t>
       </w:r>
     </w:p>
     <w:p>

</xml_diff>